<commit_message>
Tie portfolio explicitly to course content (resource mobilization theory, budget-as-tool, time considerations, environment principles, future kindergarten/Reggio)
Co-Authored-By: Claude <noreply@anthropic.com>
</commit_message>
<xml_diff>
--- a/תלקיט_ניהול_גן_כארגון.docx
+++ b/תלקיט_ניהול_גן_כארגון.docx
@@ -3511,7 +3511,7 @@
           <w:szCs w:val="24"/>
           <w:rtl w:val="1"/>
         </w:rPr>
-        <w:t>הדבר הראשון שקפץ לי לעין הוא שהסביבה כאן עובדת בשביל הילד ולא בשביל המבוגר. המשחקים ממוינים בתיבות ובמדפים לפי סדר שהילדים מכירים, החומרים נמצאים בגובה שלהם ובהישג יד, וזה מזמין אותם לבחור ולהחזיר בעצמם בלי לחכות לגננת. פינת הטכנולוגיה, שהיא הגאווה של לילה, נותנת לרעיון של גן של המאה העשרים ואחת ביטוי ממשי ולא סיסמה. גם החצר מטופלת, המתקנים יציבים ובטוחים, יש גידור, ובדיקת בטיחות נעשית כל יום. ההשגחה על המים ועל ארגז החול מדויקת, וזה לא מובן מאליו.</w:t>
+        <w:t>הדבר הראשון שקפץ לי לעין הוא שהסביבה כאן עובדת בשביל הילד ולא בשביל המבוגר. המשחקים ממוינים בתיבות ובמדפים לפי סדר שהילדים מכירים, החומרים נמצאים בגובה שלהם ובהישג יד, וזה מזמין אותם לבחור ולהחזיר בעצמם בלי לחכות לגננת. פינת הטכנולוגיה, שהיא הגאווה של לילה, נותנת לרעיון של גן של המאה העשרים ואחת ביטוי ממשי ולא סיסמה. גם החצר מטופלת, המתקנים יציבים ובטוחים, יש גידור, ובדיקת בטיחות נעשית כל יום. ההשגחה על המים ועל ארגז החול מדויקת, וזה לא מובן מאליו. אלה בדיוק העקרונות שנלמדו במצגת על ארגון הסביבה, נגישות דרך אחסון במכלים פתוחים ושקופים, מוקדי משחק שמאפשרים לילד התמצאות ובחירה עצמאית, ותנועה חופשית בטווח הראייה של הצוות.</w:t>
       </w:r>
     </w:p>
     <w:p>
@@ -3619,7 +3619,7 @@
           <w:szCs w:val="24"/>
           <w:rtl w:val="1"/>
         </w:rPr>
-        <w:t>לילה עושה את זה בעיקר דרך שני צירים. הטכנולוגיה והבינה המלאכותית נכנסות לא כגימיק אלא ככלי למידה, והילדים נחשפים דרכן לשפה, למושגים ולחקר. לצד זה, ארגון הסביבה עצמו מעביר מסר של המאה העשרים ואחת, כי הוא בנוי על בחירה, על עצמאות ועל אפשרות לעבוד לבד או יחד לפי מה שהילד רוצה. אלה בדיוק הכישורים שילד צריך היום, לנהל את עצמו, לשתף פעולה ולחקור, והמרחב הפיזי מזמן אותם.</w:t>
+        <w:t>לילה עושה את זה בעיקר דרך שני צירים. הטכנולוגיה והבינה המלאכותית נכנסות לא כגימיק אלא ככלי למידה, והילדים נחשפים דרכן לשפה, למושגים ולחקר. לצד זה, ארגון הסביבה עצמו מעביר מסר של המאה העשרים ואחת, כי הוא בנוי על בחירה, על עצמאות ועל אפשרות לעבוד לבד או יחד לפי מה שהילד רוצה. זה מתחבר ישירות למודל הגן העתידי שנלמד בקורס, שמוביל אגף החינוך לגיל הרך ורואה בילד לומד יוזם שחוקר ויוצר, וגם לתפיסת רג'יו אמיליה שהוצגה, שרואה בסביבה מעין מחנך נוסף ומעמידה את הסקרנות, היצירתיות ועבודת הצוות במרכז. אלה בדיוק הכישורים שילד צריך היום, לנהל את עצמו, לשתף פעולה ולחקור, והמרחב הפיזי בגן אשכול מזמן אותם.</w:t>
       </w:r>
     </w:p>
     <w:p>
@@ -3678,7 +3678,7 @@
           <w:szCs w:val="24"/>
           <w:rtl w:val="1"/>
         </w:rPr>
-        <w:t>כשדיברתי עם לילה הבנתי שגיוס משאבים אצלה הוא הרבה מעבר לכסף. מבחינת משאבים כספיים ופיזיים, היא נשענת על תקצוב הרשות המקומית ומשרד החינוך, ומעבר לזה גייסה ציוד טכנולוגי וכלים דיגיטליים למיזם הבינה המלאכותית. המשאב האנושי בולט לא פחות, שיתוף של ההורים בעשייה, התנדבות שלהם בפעילויות ובאירועים, וקשר עם גורמים בקהילה. יש גם משאב של ידע, ההשתלמויות וההדרכה הפדגוגית שהיא מביאה לצוות בתחומי השפה והטכנולוגיה, ומיזם מרמר שמביא תוכן ערכי של סובלנות. במילים אחרות, היא מגייסת כסף, אנשים, ידע וקשרים.</w:t>
+        <w:t>במצגת על גיוס משאבים למדנו שגיוס הוא תהליך של איתור, השגה וניהול של אמצעים לטובת שיפור הלמידה, ושעל פי תאוריית גיוס המשאבים הצלחת הארגון תלויה ביכולתו לאסוף ולנצל כמה סוגי משאבים, חומריים, אנושיים, חברתיים ומוסריים. כשבחנתי את גן אשכול דרך החלוקה הזאת ראיתי שלילה נוגעת כמעט בכולם. את המשאבים החומריים, כסף וציוד, היא מגייסת מתקצוב הרשות המקומית וממשרד החינוך, ומעבר לזה גייסה ציוד טכנולוגי וכלים דיגיטליים למיזם הבינה המלאכותית. את המשאב האנושי היא מגייסת דרך שיתוף ההורים בעשייה והתנדבותם בפעילויות ובאירועים. את המשאב החברתי דרך הקשרים עם גורמים בקהילה, ואת המשאב המוסרי והתרבותי דרך מיזם מרמר, שמביא לגן זהות ערכית של סובלנות וקבלת האחר. במילים אחרות, היא מגייסת כסף, אנשים, קשרים וערכים.</w:t>
       </w:r>
     </w:p>
     <w:p>
@@ -3791,7 +3791,7 @@
           <w:szCs w:val="24"/>
           <w:rtl w:val="1"/>
         </w:rPr>
-        <w:t>את המידע הזה אספתי בריאיון עם לילה. הנתונים הכספיים המדויקים משתנים משנה לשנה, ולכן כדאי לאמת אותם מול המספרים העדכניים שברשותה.</w:t>
+        <w:t>במצגת על ניהול התקציב הודגש שתקציב אינו רק כסף אלא כלי חינוכי, ושתכנון נכון שלו מקטין מתח ומאפשר קבלת החלטות חינוכיות מושכלות. עם התפיסה הזאת ניגשתי לריאיון עם לילה. הנתונים הכספיים המדויקים משתנים משנה לשנה, ולכן כדאי לאמת אותם מול המספרים העדכניים שברשותה.</w:t>
       </w:r>
     </w:p>
     <w:p>
@@ -3899,7 +3899,7 @@
           <w:szCs w:val="24"/>
           <w:rtl w:val="1"/>
         </w:rPr>
-        <w:t>העצה הראשונה של לילה הייתה לתכנן את התקציב לפי היעדים הפדגוגיים ולא הפוך. קודם מחליטים מה רוצים להשיג השנה, ואז מפזרים את הכסף לפי זה, כדי שלא יתבזבז על דברים יפים אך לא חשובים. העצה השנייה הייתה לנהל רישום מסודר ושקוף של כל הוצאה, ולשתף בו את הצוות. כשכולם רואים לאן הולך הכסף, קל יותר לתעדף, ונמנעים מהפתעות בסוף השנה.</w:t>
+        <w:t>העצה הראשונה של לילה הייתה לתכנן את התקציב לפי היעדים הפדגוגיים ולא הפוך. קודם מחליטים מה רוצים להשיג השנה, ואז מפזרים את הכסף לפי זה, כדי שלא יתבזבז על דברים יפים אך לא חשובים. העצה השנייה הייתה לנהל רישום מסודר ושקוף של כל הוצאה, ולשתף בו את הצוות. כשכולם רואים לאן הולך הכסף, קל יותר לתעדף, ונמנעים מהפתעות בסוף השנה. שתי העצות מתכתבות עם העקרונות שנלמדו במצגת, לתקצב על פי תוכנית עבודה שנתית, לעקוב מדי חודש כדי למנוע חריגות גדולות, לשמור על שקיפות מול ההורים, ולהשאיר כעשרה אחוזים מהתקציב למקרי חירום ולהוצאות בלתי צפויות.</w:t>
       </w:r>
     </w:p>
     <w:p>
@@ -4066,7 +4066,7 @@
           <w:szCs w:val="24"/>
           <w:rtl w:val="1"/>
         </w:rPr>
-        <w:t>לילה ענתה לי בלי היסוס. תיק מסודר הוא כמו זיכרון של הגן. הוא מאפשר רצף, גם אם היא נעדרת יום או שגננת אחרת נכנסת, ומאפשר לקבל החלטות על סמך מידע ולא על סמך תחושה. הוא גם מגן עליה, כי אם עולה שאלה או תלונה, התיעוד המסודר הוא ההוכחה שהעבודה נעשתה כמו שצריך. ובעיקר, ארגון נכון של המידע הוא סוג של כבוד לילד ולמשפחה שלו, כי הוא שומר על מה שפרטי כפרטי, ומשתמש בו רק לטובתו.</w:t>
+        <w:t>לילה ענתה לי בלי היסוס. תיק מסודר הוא כמו זיכרון של הגן. הוא מאפשר רצף, גם אם היא נעדרת יום או שגננת אחרת נכנסת, ומאפשר לקבל החלטות על סמך מידע ולא על סמך תחושה. הוא גם מגן עליה, כי אם עולה שאלה או תלונה, התיעוד המסודר הוא ההוכחה שהעבודה נעשתה כמו שצריך. ובעיקר, ארגון נכון של המידע הוא סוג של כבוד לילד ולמשפחה שלו, כי הוא שומר על מה שפרטי כפרטי, ומשתמש בו רק לטובתו. זה בדיוק מה שהודגש בקורס, שניהול תיקי הגן הוא חלק מהתפקיד הניהולי ולא עניין טכני בלבד.</w:t>
       </w:r>
     </w:p>
     <w:p>
@@ -4107,7 +4107,7 @@
           <w:szCs w:val="24"/>
           <w:rtl w:val="1"/>
         </w:rPr>
-        <w:t>התרחיש שקיבלנו מתאר גננת שמזהה שאחת מנשות הצוות נשחקת. היא חסרת סבלנות, מרימה קול ומדברת לא יפה לילדים, והגננת יודעת שברקע יש קושי אישי משמעותי בבית. מצד אחד יש חמלה ורצון לא להכביד, ומצד שני הילדים סופגים את המתח והאווירה בגן נפגעת. אלה השאלות והתשובות שלי.</w:t>
+        <w:t>התרחיש שקיבלנו מתאר גננת שמזהה שאחת מנשות הצוות נשחקת. היא חסרת סבלנות, מרימה קול ומדברת לא יפה לילדים, והגננת יודעת שברקע יש קושי אישי משמעותי בבית. יש כאן חמלה ורצון לא להכביד עליה, ובמקביל הילדים סופגים את המתח והאווירה בגן נפגעת. התרחיש נוגע בלב התפקיד הניהולי שעליו דיברנו בקורס, האחריות הכפולה של מנהלת הגן, גם כלפי הצוות שלה וגם כלפי הילדים. אלה השאלות והתשובות שלי.</w:t>
       </w:r>
     </w:p>
     <w:p>
@@ -4881,7 +4881,7 @@
           <w:szCs w:val="24"/>
           <w:rtl w:val="1"/>
         </w:rPr>
-        <w:t>התובנה הראשונה היא שהזמן בגן לא נקבע לפי השעון אלא לפי שלושה שיקולים שנפגשים, השיקול הפדגוגי, צרכי הילדים, וההזדמנויות שצצות במהלך היום. גננת טובה יודעת מתי לוותר על מה שתכננה כי קרה משהו חשוב יותר. התובנה השנייה היא שסדר יום צפוי הוא כלי לניהול התנהגות. ראיתי שדווקא בימים שבהם השגרה נשמרה, היו פחות חיכוכים בין הילדים, וזה מתחבר ישירות ליעד של לילה לצמצם אלימות. כשילד יודע מה הולך לקרות, הוא רגוע יותר.</w:t>
+        <w:t>התובנה הראשונה מתחברת ישירות למה שנלמד במצגת על ניהול הזמן, שהזמן בגן אינו נקבע לפי השעון אלא לפי שלושה שיקולים שנפגשים, השיקול הפדגוגי של הצוות, צרכי הילדים, וההזדמנויות שעולות במהלך היום. גננת טובה יודעת מתי לוותר על מה שתכננה כי קרה משהו חשוב יותר. התובנה השנייה היא שסדר יום צפוי הוא כלי לניהול התנהגות. ראיתי שדווקא בימים שבהם השגרה נשמרה היו פחות חיכוכים בין הילדים, וזה מתחבר ליעד של לילה לצמצם אלימות וגם למטרות שהוצגו בקורס, יצירת שגרה בטוחה והפחתת מעברים חדים. כלים חזותיים כמו לוח יום מצויר וטיימר צבעוני, שנלמדו במצגת, עוזרים לילדים להבין את המעברים ומורידים את המתח סביבם.</w:t>
       </w:r>
     </w:p>
     <w:p>

</xml_diff>

<commit_message>
Complete portfolio: budget estimate table + concluding summary section
Co-Authored-By: Claude <noreply@anthropic.com>
</commit_message>
<xml_diff>
--- a/תלקיט_ניהול_גן_כארגון.docx
+++ b/תלקיט_ניהול_גן_כארגון.docx
@@ -3863,7 +3863,332 @@
           <w:szCs w:val="24"/>
           <w:rtl w:val="1"/>
         </w:rPr>
-        <w:t>הסכומים אינם קבועים ותלויים במספר הילדים ובתוכניות של אותה שנה, ולכן לילה נתנה לי טווחים ולא מספרים מדויקים. עיקר התקציב השוטף מגיע מסל הגן של משרד החינוך, ומעליו נוספים תקציבי הרשות למבנה ולתחזוקה ותקציבי המיזמים. את הסכומים המדויקים לכל מקור יש להשלים מתוך הדוח הכספי שברשות לילה. (יש למלא כאן את המספרים המעודכנים מהריאיון.)</w:t>
+        <w:t>הסכומים משתנים משנה לשנה לפי מספר הילדים ולפי התוכניות, ולכן אלה הערכות שנתיות בלבד, מבוססות על הטווחים שהוצגו במצגת ועל גודל הגן, שיש לאמת מול הדוח הכספי של לילה. עיקר התקציב השוטף מגיע מסל הגן של משרד החינוך, לצד תקצוב הרשות לתחזוקה ולציוד, תשלומי הרשות של ההורים, ותקציבי מיזמים ותרומות.</w:t>
+      </w:r>
+    </w:p>
+    <w:tbl>
+      <w:tblPr>
+        <w:tblStyle w:val="TableGrid"/>
+        <w:tblW w:type="auto" w:w="0"/>
+        <w:jc w:val="right"/>
+        <w:tblLook w:firstColumn="1" w:firstRow="1" w:lastColumn="0" w:lastRow="0" w:noHBand="0" w:noVBand="1" w:val="04A0"/>
+      </w:tblPr>
+      <w:tblGrid>
+        <w:gridCol w:w="4680"/>
+        <w:gridCol w:w="4680"/>
+      </w:tblGrid>
+      <w:tr>
+        <w:tc>
+          <w:tcPr>
+            <w:tcW w:type="dxa" w:w="6192"/>
+          </w:tcPr>
+          <w:p>
+            <w:pPr>
+              <w:bidi w:val="1"/>
+              <w:jc w:val="center"/>
+            </w:pPr>
+            <w:r/>
+            <w:r>
+              <w:rPr>
+                <w:rFonts w:ascii="David" w:hAnsi="David" w:cs="David"/>
+                <w:b/>
+                <w:i w:val="0"/>
+                <w:sz w:val="22"/>
+                <w:szCs w:val="22"/>
+                <w:rtl w:val="1"/>
+              </w:rPr>
+              <w:t>מקור התקציב</w:t>
+            </w:r>
+          </w:p>
+        </w:tc>
+        <w:tc>
+          <w:tcPr>
+            <w:tcW w:type="dxa" w:w="2448"/>
+          </w:tcPr>
+          <w:p>
+            <w:pPr>
+              <w:bidi w:val="1"/>
+              <w:jc w:val="center"/>
+            </w:pPr>
+            <w:r/>
+            <w:r>
+              <w:rPr>
+                <w:rFonts w:ascii="David" w:hAnsi="David" w:cs="David"/>
+                <w:b/>
+                <w:i w:val="0"/>
+                <w:sz w:val="22"/>
+                <w:szCs w:val="22"/>
+                <w:rtl w:val="1"/>
+              </w:rPr>
+              <w:t>הערכה שנתית (₪)</w:t>
+            </w:r>
+          </w:p>
+        </w:tc>
+      </w:tr>
+      <w:tr>
+        <w:tc>
+          <w:tcPr>
+            <w:tcW w:type="dxa" w:w="6192"/>
+          </w:tcPr>
+          <w:p>
+            <w:pPr>
+              <w:bidi w:val="1"/>
+              <w:jc w:val="right"/>
+            </w:pPr>
+            <w:r/>
+            <w:r>
+              <w:rPr>
+                <w:rFonts w:ascii="David" w:hAnsi="David" w:cs="David"/>
+                <w:b w:val="0"/>
+                <w:i w:val="0"/>
+                <w:sz w:val="22"/>
+                <w:szCs w:val="22"/>
+                <w:rtl w:val="1"/>
+              </w:rPr>
+              <w:t>משרד החינוך – סל גן פדגוגי</w:t>
+            </w:r>
+          </w:p>
+        </w:tc>
+        <w:tc>
+          <w:tcPr>
+            <w:tcW w:type="dxa" w:w="2448"/>
+          </w:tcPr>
+          <w:p>
+            <w:pPr>
+              <w:bidi w:val="1"/>
+              <w:jc w:val="right"/>
+            </w:pPr>
+            <w:r/>
+            <w:r>
+              <w:rPr>
+                <w:rFonts w:ascii="David" w:hAnsi="David" w:cs="David"/>
+                <w:b w:val="0"/>
+                <w:i w:val="0"/>
+                <w:sz w:val="22"/>
+                <w:szCs w:val="22"/>
+                <w:rtl w:val="1"/>
+              </w:rPr>
+              <w:t>כ-5,000</w:t>
+            </w:r>
+          </w:p>
+        </w:tc>
+      </w:tr>
+      <w:tr>
+        <w:tc>
+          <w:tcPr>
+            <w:tcW w:type="dxa" w:w="6192"/>
+          </w:tcPr>
+          <w:p>
+            <w:pPr>
+              <w:bidi w:val="1"/>
+              <w:jc w:val="right"/>
+            </w:pPr>
+            <w:r/>
+            <w:r>
+              <w:rPr>
+                <w:rFonts w:ascii="David" w:hAnsi="David" w:cs="David"/>
+                <w:b w:val="0"/>
+                <w:i w:val="0"/>
+                <w:sz w:val="22"/>
+                <w:szCs w:val="22"/>
+                <w:rtl w:val="1"/>
+              </w:rPr>
+              <w:t>הרשות המקומית שגב שלום – תחזוקה וציוד</w:t>
+            </w:r>
+          </w:p>
+        </w:tc>
+        <w:tc>
+          <w:tcPr>
+            <w:tcW w:type="dxa" w:w="2448"/>
+          </w:tcPr>
+          <w:p>
+            <w:pPr>
+              <w:bidi w:val="1"/>
+              <w:jc w:val="right"/>
+            </w:pPr>
+            <w:r/>
+            <w:r>
+              <w:rPr>
+                <w:rFonts w:ascii="David" w:hAnsi="David" w:cs="David"/>
+                <w:b w:val="0"/>
+                <w:i w:val="0"/>
+                <w:sz w:val="22"/>
+                <w:szCs w:val="22"/>
+                <w:rtl w:val="1"/>
+              </w:rPr>
+              <w:t>כ-6,000</w:t>
+            </w:r>
+          </w:p>
+        </w:tc>
+      </w:tr>
+      <w:tr>
+        <w:tc>
+          <w:tcPr>
+            <w:tcW w:type="dxa" w:w="6192"/>
+          </w:tcPr>
+          <w:p>
+            <w:pPr>
+              <w:bidi w:val="1"/>
+              <w:jc w:val="right"/>
+            </w:pPr>
+            <w:r/>
+            <w:r>
+              <w:rPr>
+                <w:rFonts w:ascii="David" w:hAnsi="David" w:cs="David"/>
+                <w:b w:val="0"/>
+                <w:i w:val="0"/>
+                <w:sz w:val="22"/>
+                <w:szCs w:val="22"/>
+                <w:rtl w:val="1"/>
+              </w:rPr>
+              <w:t>תשלומי הורים (תשלומי רשות: ביטוח, טיולים, סל תרבות)</w:t>
+            </w:r>
+          </w:p>
+        </w:tc>
+        <w:tc>
+          <w:tcPr>
+            <w:tcW w:type="dxa" w:w="2448"/>
+          </w:tcPr>
+          <w:p>
+            <w:pPr>
+              <w:bidi w:val="1"/>
+              <w:jc w:val="right"/>
+            </w:pPr>
+            <w:r/>
+            <w:r>
+              <w:rPr>
+                <w:rFonts w:ascii="David" w:hAnsi="David" w:cs="David"/>
+                <w:b w:val="0"/>
+                <w:i w:val="0"/>
+                <w:sz w:val="22"/>
+                <w:szCs w:val="22"/>
+                <w:rtl w:val="1"/>
+              </w:rPr>
+              <w:t>כ-15,750 (כ-450 לילד × 35)</w:t>
+            </w:r>
+          </w:p>
+        </w:tc>
+      </w:tr>
+      <w:tr>
+        <w:tc>
+          <w:tcPr>
+            <w:tcW w:type="dxa" w:w="6192"/>
+          </w:tcPr>
+          <w:p>
+            <w:pPr>
+              <w:bidi w:val="1"/>
+              <w:jc w:val="right"/>
+            </w:pPr>
+            <w:r/>
+            <w:r>
+              <w:rPr>
+                <w:rFonts w:ascii="David" w:hAnsi="David" w:cs="David"/>
+                <w:b w:val="0"/>
+                <w:i w:val="0"/>
+                <w:sz w:val="22"/>
+                <w:szCs w:val="22"/>
+                <w:rtl w:val="1"/>
+              </w:rPr>
+              <w:t>מיזמים ותרומות</w:t>
+            </w:r>
+          </w:p>
+        </w:tc>
+        <w:tc>
+          <w:tcPr>
+            <w:tcW w:type="dxa" w:w="2448"/>
+          </w:tcPr>
+          <w:p>
+            <w:pPr>
+              <w:bidi w:val="1"/>
+              <w:jc w:val="right"/>
+            </w:pPr>
+            <w:r/>
+            <w:r>
+              <w:rPr>
+                <w:rFonts w:ascii="David" w:hAnsi="David" w:cs="David"/>
+                <w:b w:val="0"/>
+                <w:i w:val="0"/>
+                <w:sz w:val="22"/>
+                <w:szCs w:val="22"/>
+                <w:rtl w:val="1"/>
+              </w:rPr>
+              <w:t>כ-3,000</w:t>
+            </w:r>
+          </w:p>
+        </w:tc>
+      </w:tr>
+      <w:tr>
+        <w:tc>
+          <w:tcPr>
+            <w:tcW w:type="dxa" w:w="6192"/>
+          </w:tcPr>
+          <w:p>
+            <w:pPr>
+              <w:bidi w:val="1"/>
+              <w:jc w:val="right"/>
+            </w:pPr>
+            <w:r/>
+            <w:r>
+              <w:rPr>
+                <w:rFonts w:ascii="David" w:hAnsi="David" w:cs="David"/>
+                <w:b w:val="0"/>
+                <w:i w:val="0"/>
+                <w:sz w:val="22"/>
+                <w:szCs w:val="22"/>
+                <w:rtl w:val="1"/>
+              </w:rPr>
+              <w:t>סה"כ מוערך (ללא שכר צוות המשולם מרכזית)</w:t>
+            </w:r>
+          </w:p>
+        </w:tc>
+        <w:tc>
+          <w:tcPr>
+            <w:tcW w:type="dxa" w:w="2448"/>
+          </w:tcPr>
+          <w:p>
+            <w:pPr>
+              <w:bidi w:val="1"/>
+              <w:jc w:val="right"/>
+            </w:pPr>
+            <w:r/>
+            <w:r>
+              <w:rPr>
+                <w:rFonts w:ascii="David" w:hAnsi="David" w:cs="David"/>
+                <w:b w:val="0"/>
+                <w:i w:val="0"/>
+                <w:sz w:val="22"/>
+                <w:szCs w:val="22"/>
+                <w:rtl w:val="1"/>
+              </w:rPr>
+              <w:t>כ-29,750</w:t>
+            </w:r>
+          </w:p>
+        </w:tc>
+      </w:tr>
+    </w:tbl>
+    <w:p>
+      <w:pPr>
+        <w:bidi w:val="1"/>
+        <w:spacing w:line="360" w:lineRule="auto" w:after="40"/>
+        <w:jc w:val="both"/>
+      </w:pPr>
+    </w:p>
+    <w:p>
+      <w:pPr>
+        <w:bidi w:val="1"/>
+        <w:spacing w:line="360" w:lineRule="auto" w:after="160"/>
+        <w:jc w:val="both"/>
+      </w:pPr>
+      <w:r>
+        <w:rPr>
+          <w:rFonts w:ascii="David" w:hAnsi="David" w:cs="David"/>
+          <w:b w:val="0"/>
+          <w:i w:val="0"/>
+          <w:sz w:val="22"/>
+          <w:szCs w:val="22"/>
+          <w:rtl w:val="1"/>
+        </w:rPr>
+        <w:t>שוב, המספרים כאן הם הערכה לצורך הדגמה. יש להחליף אותם בנתונים המדויקים שלילה מנהלת בפועל.</w:t>
       </w:r>
     </w:p>
     <w:p>
@@ -5460,6 +5785,83 @@
         <w:t>הייתי בונה אותה כטבלה שנתית אחת, מחולקת לחודשים, עם עמודה קבועה למשימות מנהליות ועמודה נפרדת ליעדים הפדגוגיים, כך שהעין רואה את שתיהן זו לצד זו אבל לא מבלבלת ביניהן. הייתי מוסיפה עמודה של אחראי ותאריך יעד לכל משימה, כי מה שאין לו תאריך נוטה להיעלם. תוכנית כזאת לא רק מסדרת את העבודה, היא גם מורידה עומס מהראש של המנהלת.</w:t>
       </w:r>
     </w:p>
+    <w:p>
+      <w:r>
+        <w:br w:type="page"/>
+      </w:r>
+    </w:p>
+    <w:p>
+      <w:pPr>
+        <w:bidi w:val="1"/>
+        <w:spacing w:line="360" w:lineRule="auto" w:after="200"/>
+        <w:jc w:val="right"/>
+      </w:pPr>
+      <w:r>
+        <w:rPr>
+          <w:rFonts w:ascii="David" w:hAnsi="David" w:cs="David"/>
+          <w:b/>
+          <w:i w:val="0"/>
+          <w:sz w:val="30"/>
+          <w:szCs w:val="30"/>
+          <w:rtl w:val="1"/>
+        </w:rPr>
+        <w:t>סיכום</w:t>
+      </w:r>
+    </w:p>
+    <w:p>
+      <w:pPr>
+        <w:bidi w:val="1"/>
+        <w:spacing w:line="360" w:lineRule="auto" w:after="160"/>
+        <w:jc w:val="both"/>
+      </w:pPr>
+      <w:r>
+        <w:rPr>
+          <w:rFonts w:ascii="David" w:hAnsi="David" w:cs="David"/>
+          <w:b w:val="0"/>
+          <w:i w:val="0"/>
+          <w:sz w:val="24"/>
+          <w:szCs w:val="24"/>
+          <w:rtl w:val="1"/>
+        </w:rPr>
+        <w:t>כשאני מסתכלת על כל המרכיבים ביחד, הדבר שהכי התבהר לי הוא שניהול גן איננו שני עולמות נפרדים, האחד פדגוגי והאחר מנהלי, אלא מערכת אחת שבה כל חלק מחזיק את השני. סדר יום מתוכנן מאפשר למידה, תקציב שמנוהל נכון קונה ציוד שמעשיר את הסביבה, סביבה מאורגנת מפחיתה חיכוכים, ותיקים מסודרים שומרים על רצף ועל כבוד הילד. בגן אשכול ראיתי את החיבור הזה עובד, וגם ראיתי היכן הוא נמתח.</w:t>
+      </w:r>
+    </w:p>
+    <w:p>
+      <w:pPr>
+        <w:bidi w:val="1"/>
+        <w:spacing w:line="360" w:lineRule="auto" w:after="160"/>
+        <w:jc w:val="both"/>
+      </w:pPr>
+      <w:r>
+        <w:rPr>
+          <w:rFonts w:ascii="David" w:hAnsi="David" w:cs="David"/>
+          <w:b w:val="0"/>
+          <w:i w:val="0"/>
+          <w:sz w:val="24"/>
+          <w:szCs w:val="24"/>
+          <w:rtl w:val="1"/>
+        </w:rPr>
+        <w:t>החוזק של לילה ברור. היא מנהלת גן עם קו חינוכי, נשענת על טכנולוגיה ועל בינה מלאכותית לא כקישוט, מגייסת משאבים מהקהילה, ומחזיקה סביבה שמכבדת את הילד ומעודדת עצמאות ובחירה. האתגרים שלה אמיתיים לא פחות, הצפיפות של שלושים וחמישה ילדים בחלל אחד, החיכוכים שנובעים ממנה, והיעדר שעות של אנשי מקצוע תומכים. אלה בדיוק המקומות שבהם עבודה מנהלית טובה, פינת רוגע, חצר עשירה יותר, גיוס שעות תמיכה ותוכנית מנהלית מסודרת, יכולה לעשות את ההבדל.</w:t>
+      </w:r>
+    </w:p>
+    <w:p>
+      <w:pPr>
+        <w:bidi w:val="1"/>
+        <w:spacing w:line="360" w:lineRule="auto" w:after="160"/>
+        <w:jc w:val="both"/>
+      </w:pPr>
+      <w:r>
+        <w:rPr>
+          <w:rFonts w:ascii="David" w:hAnsi="David" w:cs="David"/>
+          <w:b w:val="0"/>
+          <w:i w:val="0"/>
+          <w:sz w:val="24"/>
+          <w:szCs w:val="24"/>
+          <w:rtl w:val="1"/>
+        </w:rPr>
+        <w:t>מה שאני לוקחת איתי מההכשרה ומהקורס הוא שהמנהלת היא זו שמאפשרת לכל השאר לקרות. היא לא רק מלמדת, היא בונה את התנאים שבתוכם הלמידה, הבטיחות והשייכות מתקיימים. זו עבודה שקטה שלא תמיד רואים, אבל בלעדיה הגן פשוט לא מחזיק.</w:t>
+      </w:r>
+    </w:p>
     <w:sectPr>
       <w:pgSz w:w="12240" w:h="15840"/>
       <w:pgMar w:top="1440" w:right="1440" w:bottom="1440" w:left="1440" w:header="720" w:footer="720" w:gutter="0"/>

</xml_diff>

<commit_message>
Add Ono Academic College logo to portfolio title page
Co-Authored-By: Claude <noreply@anthropic.com>
</commit_message>
<xml_diff>
--- a/תלקיט_ניהול_גן_כארגון.docx
+++ b/תלקיט_ניהול_גן_כארגון.docx
@@ -11,10 +11,43 @@
     </w:p>
     <w:p>
       <w:pPr>
-        <w:bidi w:val="1"/>
-        <w:spacing w:line="360" w:lineRule="auto" w:after="0"/>
-        <w:jc w:val="both"/>
+        <w:spacing w:after="280"/>
+        <w:jc w:val="center"/>
       </w:pPr>
+      <w:r>
+        <w:drawing>
+          <wp:inline xmlns:a="http://schemas.openxmlformats.org/drawingml/2006/main" xmlns:pic="http://schemas.openxmlformats.org/drawingml/2006/picture">
+            <wp:extent cx="1737360" cy="1737360"/>
+            <wp:docPr id="1" name="Picture 1"/>
+            <wp:cNvGraphicFramePr>
+              <a:graphicFrameLocks noChangeAspect="1"/>
+            </wp:cNvGraphicFramePr>
+            <a:graphic>
+              <a:graphicData uri="http://schemas.openxmlformats.org/drawingml/2006/picture">
+                <pic:pic>
+                  <pic:nvPicPr>
+                    <pic:cNvPr id="0" name="960e2fb4-IMG_7818.jpeg"/>
+                    <pic:cNvPicPr/>
+                  </pic:nvPicPr>
+                  <pic:blipFill>
+                    <a:blip r:embed="rId9"/>
+                    <a:stretch>
+                      <a:fillRect/>
+                    </a:stretch>
+                  </pic:blipFill>
+                  <pic:spPr>
+                    <a:xfrm>
+                      <a:off x="0" y="0"/>
+                      <a:ext cx="1737360" cy="1737360"/>
+                    </a:xfrm>
+                    <a:prstGeom prst="rect"/>
+                  </pic:spPr>
+                </pic:pic>
+              </a:graphicData>
+            </a:graphic>
+          </wp:inline>
+        </w:drawing>
+      </w:r>
     </w:p>
     <w:p>
       <w:pPr>

</xml_diff>

<commit_message>
Integrate two peer-reviewed articles (Abuhatzira & Barat; Kaduri-Shlezak & Stock) with citations and bibliography
Co-Authored-By: Claude <noreply@anthropic.com>
</commit_message>
<xml_diff>
--- a/תלקיט_ניהול_גן_כארגון.docx
+++ b/תלקיט_ניהול_גן_כארגון.docx
@@ -3622,6 +3622,24 @@
     <w:p>
       <w:pPr>
         <w:bidi w:val="1"/>
+        <w:spacing w:line="360" w:lineRule="auto" w:after="160"/>
+        <w:jc w:val="both"/>
+      </w:pPr>
+      <w:r>
+        <w:rPr>
+          <w:rFonts w:ascii="David" w:hAnsi="David" w:cs="David"/>
+          <w:b w:val="0"/>
+          <w:i w:val="0"/>
+          <w:sz w:val="24"/>
+          <w:szCs w:val="24"/>
+          <w:rtl w:val="1"/>
+        </w:rPr>
+        <w:t>מעבר לחצר עצמה, מחקר שבחן תפיסות של גננות לגבי למידה חוץ-גנית בסביבה הטבעית מצא שהגננות רואות בסביבה הטבעית מרחב שמרגיע את הילדים, מזמן להם לפתור קונפליקטים בשיח ולא באלימות, ומעודד שיתוף פעולה ולמידה אותנטית (כדורי-שלזק וסטוק, 2024). בשביל גן שאחד היעדים המרכזיים שלו הוא צמצום אלימות, יציאה קבועה לסביבה הטבעית הקרובה יכולה להיות כלי ממשי ולא רק העשרה, וזה מתחבר גם לתפיסת הגן העתידי שהמחקר נשען עליה.</w:t>
+      </w:r>
+    </w:p>
+    <w:p>
+      <w:pPr>
+        <w:bidi w:val="1"/>
         <w:spacing w:line="360" w:lineRule="auto" w:after="80"/>
         <w:jc w:val="both"/>
       </w:pPr>
@@ -3747,7 +3765,7 @@
           <w:szCs w:val="24"/>
           <w:rtl w:val="1"/>
         </w:rPr>
-        <w:t>החוסר שהכי בלט לי הוא בשעות של אנשי מקצוע תומכים. בגן עם שלושים וחמישה ילדים, בלי סייעת חינוכית ובלי שעות קבועות של יועצת או מטפלת רגשית, לילה והצוות סופגים לבד את כל העומס הרגשי וההתנהגותי. חסר גם ציוד לחצר, וחומרים דו-לשוניים בעברית ובערבית שיתמכו ביעד של צמצום הפערים בשפה.</w:t>
+        <w:t>החוסר שהכי בלט לי הוא בשעות של אנשי מקצוע תומכים. בגן עם שלושים וחמישה ילדים, בלי סייעת חינוכית ובלי שעות קבועות של יועצת או מטפלת רגשית, לילה והצוות סופגים לבד את כל העומס הרגשי וההתנהגותי. חסר גם ציוד לחצר, וחומרים דו-לשוניים בעברית ובערבית שיתמכו ביעד של צמצום הפערים בשפה. מחקר שבחן את מערך הייעוץ החינוכי לגיל הרך מצא שהייעוץ מסייע לגננות להתמודד עם אתגרים טכנולוגיים ומשפחתיים ועם שילוב ילדים עם צרכים מיוחדים, ותורם לפיתוח מקצועי של הצוות, אך הוא תלוי בתקצוב שעות ייעוץ ובתמיכת הפיקוח (אבוחצירא ובארט, תשפ"ג). זהו בדיוק סוג המשאב שחסר בגן אשכול, ושכדאי לפעול לגייס.</w:t>
       </w:r>
     </w:p>
     <w:p>
@@ -5895,6 +5913,159 @@
         <w:t>מה שאני לוקחת איתי מההכשרה ומהקורס הוא שהמנהלת היא זו שמאפשרת לכל השאר לקרות. היא לא רק מלמדת, היא בונה את התנאים שבתוכם הלמידה, הבטיחות והשייכות מתקיימים. זו עבודה שקטה שלא תמיד רואים, אבל בלעדיה הגן פשוט לא מחזיק.</w:t>
       </w:r>
     </w:p>
+    <w:p>
+      <w:r>
+        <w:br w:type="page"/>
+      </w:r>
+    </w:p>
+    <w:p>
+      <w:pPr>
+        <w:bidi w:val="1"/>
+        <w:spacing w:line="360" w:lineRule="auto" w:after="200"/>
+        <w:jc w:val="right"/>
+      </w:pPr>
+      <w:r>
+        <w:rPr>
+          <w:rFonts w:ascii="David" w:hAnsi="David" w:cs="David"/>
+          <w:b/>
+          <w:i w:val="0"/>
+          <w:sz w:val="30"/>
+          <w:szCs w:val="30"/>
+          <w:rtl w:val="1"/>
+        </w:rPr>
+        <w:t>רשימת מקורות</w:t>
+      </w:r>
+    </w:p>
+    <w:p>
+      <w:pPr>
+        <w:bidi w:val="1"/>
+        <w:spacing w:line="360" w:lineRule="auto" w:after="200"/>
+        <w:ind w:left="720" w:hanging="720"/>
+        <w:jc w:val="both"/>
+      </w:pPr>
+      <w:r>
+        <w:rPr>
+          <w:rFonts w:ascii="David" w:hAnsi="David" w:cs="David"/>
+          <w:b w:val="0"/>
+          <w:i w:val="0"/>
+          <w:sz w:val="24"/>
+          <w:szCs w:val="24"/>
+          <w:rtl w:val="1"/>
+        </w:rPr>
+        <w:t xml:space="preserve">אבוחצירא, א', ובארט, ע' (תשפ"ג). תפיסות של גננות, של יועצות ושל מפקחות גני ילדים בנושא חשיבות הטמעת מערך הייעוץ החינוכי לגיל הרך בגנים חרדיים, ותפיסותיהן בנושא מניעים וחסמים של המערך. </w:t>
+      </w:r>
+      <w:r>
+        <w:rPr>
+          <w:rFonts w:ascii="David" w:hAnsi="David" w:cs="David"/>
+          <w:b w:val="0"/>
+          <w:i/>
+          <w:sz w:val="24"/>
+          <w:szCs w:val="24"/>
+          <w:rtl w:val="1"/>
+        </w:rPr>
+        <w:t>הייעוץ החינוכי, כד</w:t>
+      </w:r>
+      <w:r>
+        <w:rPr>
+          <w:rFonts w:ascii="David" w:hAnsi="David" w:cs="David"/>
+          <w:b w:val="0"/>
+          <w:i w:val="0"/>
+          <w:sz w:val="24"/>
+          <w:szCs w:val="24"/>
+          <w:rtl w:val="1"/>
+        </w:rPr>
+        <w:t>, 183-201.</w:t>
+      </w:r>
+      <w:r>
+        <w:rPr>
+          <w:rFonts w:ascii="David" w:hAnsi="David" w:cs="David"/>
+          <w:b w:val="0"/>
+          <w:i w:val="0"/>
+          <w:sz w:val="24"/>
+          <w:szCs w:val="24"/>
+          <w:rtl w:val="1"/>
+        </w:rPr>
+        <w:t xml:space="preserve"> </w:t>
+      </w:r>
+      <w:hyperlink r:id="rId10">
+        <w:r>
+          <w:rPr>
+            <w:rFonts w:ascii="David" w:hAnsi="David" w:cs="David"/>
+            <w:sz w:val="24"/>
+            <w:szCs w:val="24"/>
+            <w:color w:val="0563C1"/>
+            <w:u w:val="single"/>
+            <w:rtl w:val="1"/>
+          </w:rPr>
+          <w:t xml:space="preserve">https://www.shaanan.ac.il/laor/ktav_et_yeuz_hinuchi/</w:t>
+        </w:r>
+      </w:hyperlink>
+    </w:p>
+    <w:p>
+      <w:pPr>
+        <w:bidi w:val="1"/>
+        <w:spacing w:line="360" w:lineRule="auto" w:after="200"/>
+        <w:ind w:left="720" w:hanging="720"/>
+        <w:jc w:val="both"/>
+      </w:pPr>
+      <w:r>
+        <w:rPr>
+          <w:rFonts w:ascii="David" w:hAnsi="David" w:cs="David"/>
+          <w:b w:val="0"/>
+          <w:i w:val="0"/>
+          <w:sz w:val="24"/>
+          <w:szCs w:val="24"/>
+          <w:rtl w:val="1"/>
+        </w:rPr>
+        <w:t xml:space="preserve">כדורי-שלזק, מ', וסטוק, ט' (2024). תפיסות של גננות לגבי למידה חוץ-גנית בסביבה הטבעית. </w:t>
+      </w:r>
+      <w:r>
+        <w:rPr>
+          <w:rFonts w:ascii="David" w:hAnsi="David" w:cs="David"/>
+          <w:b w:val="0"/>
+          <w:i/>
+          <w:sz w:val="24"/>
+          <w:szCs w:val="24"/>
+          <w:rtl w:val="1"/>
+        </w:rPr>
+        <w:t>חוקרים @ הגיל הרך, 19</w:t>
+      </w:r>
+      <w:r>
+        <w:rPr>
+          <w:rFonts w:ascii="David" w:hAnsi="David" w:cs="David"/>
+          <w:b w:val="0"/>
+          <w:i w:val="0"/>
+          <w:sz w:val="24"/>
+          <w:szCs w:val="24"/>
+          <w:rtl w:val="1"/>
+        </w:rPr>
+        <w:t>, 61-92.</w:t>
+      </w:r>
+      <w:r>
+        <w:rPr>
+          <w:rFonts w:ascii="David" w:hAnsi="David" w:cs="David"/>
+          <w:b w:val="0"/>
+          <w:i w:val="0"/>
+          <w:sz w:val="24"/>
+          <w:szCs w:val="24"/>
+          <w:rtl w:val="1"/>
+        </w:rPr>
+        <w:t xml:space="preserve"> </w:t>
+      </w:r>
+      <w:hyperlink r:id="rId11">
+        <w:r>
+          <w:rPr>
+            <w:rFonts w:ascii="David" w:hAnsi="David" w:cs="David"/>
+            <w:sz w:val="24"/>
+            <w:szCs w:val="24"/>
+            <w:color w:val="0563C1"/>
+            <w:u w:val="single"/>
+            <w:rtl w:val="1"/>
+          </w:rPr>
+          <w:t xml:space="preserve">https://levinsky.dooble.us/wp-content/uploads/2024/11/Issue19_Article3.pdf</w:t>
+        </w:r>
+      </w:hyperlink>
+    </w:p>
     <w:sectPr>
       <w:pgSz w:w="12240" w:h="15840"/>
       <w:pgMar w:top="1440" w:right="1440" w:bottom="1440" w:left="1440" w:header="720" w:footer="720" w:gutter="0"/>

</xml_diff>

<commit_message>
Clean stray en-dashes in budget table labels
Co-Authored-By: Claude <noreply@anthropic.com>
</commit_message>
<xml_diff>
--- a/תלקיט_ניהול_גן_כארגון.docx
+++ b/תלקיט_ניהול_גן_כארגון.docx
@@ -3996,7 +3996,7 @@
                 <w:szCs w:val="22"/>
                 <w:rtl w:val="1"/>
               </w:rPr>
-              <w:t>משרד החינוך – סל גן פדגוגי</w:t>
+              <w:t>משרד החינוך, סל גן פדגוגי</w:t>
             </w:r>
           </w:p>
         </w:tc>
@@ -4044,7 +4044,7 @@
                 <w:szCs w:val="22"/>
                 <w:rtl w:val="1"/>
               </w:rPr>
-              <w:t>הרשות המקומית שגב שלום – תחזוקה וציוד</w:t>
+              <w:t>הרשות המקומית שגב שלום, תחזוקה וציוד</w:t>
             </w:r>
           </w:p>
         </w:tc>

</xml_diff>